<commit_message>
docs(informe-final): agregar anexos de evidencia de pruebas y corregir métricas reales
- Actualiza InformeFinal con sección de Anexos A-I con capturas reales de tests
- Corrige puntaje Lighthouse: escritorio Rendimiento 63, Accesibilidad 84, SEO 92
- Corrige PR-04: 4 escenarios de carga (máx. 20 req / 10 concurrentes), no 50
- Agrega carpeta con 15 archivos de evidencia: pruebas unitarias, funcionales,
  seguridad, integración, rendimiento, métricas IA, Lighthouse y UptimeRobot
</commit_message>
<xml_diff>
--- a/Documentacion/word/InformeFinal_TratoHecho_FINAL.docx
+++ b/Documentacion/word/InformeFinal_TratoHecho_FINAL.docx
@@ -7194,7 +7194,7 @@
                 <w:sz w:val="16"/>
                 <w:szCs w:val="16"/>
               </w:rPr>
-              <w:t xml:space="preserve">Score 84 pts (mobile 76 / desktop 91)</w:t>
+              <w:t xml:space="preserve">Escritorio: Rendimiento 63 · Accesibilidad 84 · SEO 92 · Recomendaciones 78</w:t>
             </w:r>
           </w:p>
         </w:tc>
@@ -20197,7 +20197,7 @@
                 <w:sz w:val="19"/>
                 <w:szCs w:val="19"/>
               </w:rPr>
-              <w:t>Score 84 (mobile 76 / desktop 91)</w:t>
+              <w:t>Escritorio: Rendimiento 63 · Accesibilidad 84 · SEO 92 · Recomendaciones 78</w:t>
             </w:r>
           </w:p>
         </w:tc>
@@ -20514,7 +20514,7 @@
                 <w:szCs w:val="19"/>
               </w:rPr>
               <w:lastRenderedPageBreak/>
-              <w:t>Carga concurrente 50 peticiones (PR-04)</w:t>
+              <w:t>Carga concurrente — 4 escenarios (PR-04)</w:t>
             </w:r>
           </w:p>
         </w:tc>
@@ -20576,7 +20576,7 @@
                 <w:sz w:val="19"/>
                 <w:szCs w:val="19"/>
               </w:rPr>
-              <w:t>50/50 OK sin timeouts</w:t>
+              <w:t>Carga alta: 20 req / 10 concurrentes — todos los umbrales cumplidos</w:t>
             </w:r>
           </w:p>
         </w:tc>
@@ -21221,6 +21221,950 @@
                       <a:avLst/>
                     </a:prstGeom>
                     <a:noFill/>
+                    <a:ln>
+                      <a:noFill/>
+                    </a:ln>
+                  </pic:spPr>
+                </pic:pic>
+              </a:graphicData>
+            </a:graphic>
+          </wp:inline>
+        </w:drawing>
+      </w:r>
+    </w:p>
+    <w:p>
+      <w:r>
+        <w:br w:type="page"/>
+      </w:r>
+    </w:p>
+    <w:p>
+      <w:pPr>
+        <w:pBdr>
+          <w:bottom w:val="single" w:sz="6" w:space="4" w:color="1A5276"/>
+        </w:pBdr>
+        <w:spacing w:before="280" w:after="100" w:line="276" w:lineRule="auto"/>
+      </w:pPr>
+      <w:r>
+        <w:rPr>
+          <w:b/>
+          <w:bCs/>
+          <w:color w:val="1A5276"/>
+          <w:sz w:val="28"/>
+          <w:szCs w:val="28"/>
+        </w:rPr>
+        <w:t>Anexos — Evidencia de Pruebas Automatizadas</w:t>
+      </w:r>
+    </w:p>
+    <w:p>
+      <w:pPr>
+        <w:spacing w:before="60" w:after="60" w:line="276" w:lineRule="auto"/>
+      </w:pPr>
+      <w:r>
+        <w:rPr>
+          <w:sz w:val="18"/>
+          <w:szCs w:val="18"/>
+        </w:rPr>
+        <w:t xml:space="preserve">Los siguientes anexos contienen las capturas de pantalla reales obtenidas durante la ejecución de la suite de pruebas automatizadas (Jest) y las herramientas de monitoreo del sistema.</w:t>
+      </w:r>
+    </w:p>
+    <w:p>
+      <w:pPr>
+        <w:spacing w:before="180" w:after="60" w:line="276" w:lineRule="auto"/>
+      </w:pPr>
+      <w:r>
+        <w:rPr>
+          <w:b/>
+          <w:bCs/>
+          <w:color w:val="2E4057"/>
+          <w:sz w:val="22"/>
+          <w:szCs w:val="22"/>
+        </w:rPr>
+        <w:t>Anexo A — Resumen Global de la Suite de Pruebas</w:t>
+      </w:r>
+    </w:p>
+    <w:p>
+      <w:pPr>
+        <w:spacing w:before="60" w:after="60" w:line="276" w:lineRule="auto"/>
+      </w:pPr>
+      <w:r>
+        <w:rPr>
+          <w:sz w:val="18"/>
+          <w:szCs w:val="18"/>
+        </w:rPr>
+        <w:t xml:space="preserve">7 suites ejecutadas · 139 tests aprobados · 0 fallidos · Tiempo total: 190.131 s</w:t>
+      </w:r>
+    </w:p>
+    <w:p>
+      <w:pPr>
+        <w:jc w:val="center"/>
+        <w:spacing w:before="120" w:after="120"/>
+      </w:pPr>
+      <w:r>
+        <w:drawing>
+          <wp:inline xmlns:wp="http://schemas.openxmlformats.org/drawingml/2006/wordprocessingDrawing">
+            <wp:extent cx="4680000" cy="1522602"/>
+            <wp:effectExtent l="0" t="0" r="0" b="0"/>
+            <wp:docPr id="101" name="Anexo101" descr="Evidencia"/>
+            <wp:cNvGraphicFramePr>
+              <a:graphicFrameLocks xmlns:a="http://schemas.openxmlformats.org/drawingml/2006/main" noChangeAspect="1"/>
+            </wp:cNvGraphicFramePr>
+            <a:graphic xmlns:a="http://schemas.openxmlformats.org/drawingml/2006/main">
+              <a:graphicData uri="http://schemas.openxmlformats.org/drawingml/2006/picture">
+                <pic:pic xmlns:pic="http://schemas.openxmlformats.org/drawingml/2006/picture">
+                  <pic:nvPicPr>
+                    <pic:cNvPr id="101" name="Anexo101"/>
+                    <pic:cNvPicPr/>
+                  </pic:nvPicPr>
+                  <pic:blipFill>
+                    <a:blip xmlns:r="http://schemas.openxmlformats.org/officeDocument/2006/relationships" r:embed="rId20"/>
+                    <a:stretch>
+                      <a:fillRect/>
+                    </a:stretch>
+                  </pic:blipFill>
+                  <pic:spPr>
+                    <a:xfrm>
+                      <a:off x="0" y="0"/>
+                      <a:ext cx="4680000" cy="1522602"/>
+                    </a:xfrm>
+                    <a:prstGeom prst="rect">
+                      <a:avLst/>
+                    </a:prstGeom>
+                    <a:ln>
+                      <a:noFill/>
+                    </a:ln>
+                  </pic:spPr>
+                </pic:pic>
+              </a:graphicData>
+            </a:graphic>
+          </wp:inline>
+        </w:drawing>
+      </w:r>
+    </w:p>
+    <w:p>
+      <w:pPr>
+        <w:spacing w:before="180" w:after="60" w:line="276" w:lineRule="auto"/>
+      </w:pPr>
+      <w:r>
+        <w:rPr>
+          <w:b/>
+          <w:bCs/>
+          <w:color w:val="2E4057"/>
+          <w:sz w:val="22"/>
+          <w:szCs w:val="22"/>
+        </w:rPr>
+        <w:t>Anexo B — Pruebas Unitarias</w:t>
+      </w:r>
+    </w:p>
+    <w:p>
+      <w:pPr>
+        <w:spacing w:before="60" w:after="60" w:line="276" w:lineRule="auto"/>
+      </w:pPr>
+      <w:r>
+        <w:rPr>
+          <w:sz w:val="18"/>
+          <w:szCs w:val="18"/>
+        </w:rPr>
+        <w:t xml:space="preserve">B.1 — priceCalc.test.js: cálculo de precios, parseo de dimensiones y catálogo de productos (PASS)</w:t>
+      </w:r>
+    </w:p>
+    <w:p>
+      <w:pPr>
+        <w:jc w:val="center"/>
+        <w:spacing w:before="120" w:after="120"/>
+      </w:pPr>
+      <w:r>
+        <w:drawing>
+          <wp:inline xmlns:wp="http://schemas.openxmlformats.org/drawingml/2006/wordprocessingDrawing">
+            <wp:extent cx="4644271" cy="5500000"/>
+            <wp:effectExtent l="0" t="0" r="0" b="0"/>
+            <wp:docPr id="102" name="Anexo102" descr="Evidencia"/>
+            <wp:cNvGraphicFramePr>
+              <a:graphicFrameLocks xmlns:a="http://schemas.openxmlformats.org/drawingml/2006/main" noChangeAspect="1"/>
+            </wp:cNvGraphicFramePr>
+            <a:graphic xmlns:a="http://schemas.openxmlformats.org/drawingml/2006/main">
+              <a:graphicData uri="http://schemas.openxmlformats.org/drawingml/2006/picture">
+                <pic:pic xmlns:pic="http://schemas.openxmlformats.org/drawingml/2006/picture">
+                  <pic:nvPicPr>
+                    <pic:cNvPr id="102" name="Anexo102"/>
+                    <pic:cNvPicPr/>
+                  </pic:nvPicPr>
+                  <pic:blipFill>
+                    <a:blip xmlns:r="http://schemas.openxmlformats.org/officeDocument/2006/relationships" r:embed="rId21"/>
+                    <a:stretch>
+                      <a:fillRect/>
+                    </a:stretch>
+                  </pic:blipFill>
+                  <pic:spPr>
+                    <a:xfrm>
+                      <a:off x="0" y="0"/>
+                      <a:ext cx="4644271" cy="5500000"/>
+                    </a:xfrm>
+                    <a:prstGeom prst="rect">
+                      <a:avLst/>
+                    </a:prstGeom>
+                    <a:ln>
+                      <a:noFill/>
+                    </a:ln>
+                  </pic:spPr>
+                </pic:pic>
+              </a:graphicData>
+            </a:graphic>
+          </wp:inline>
+        </w:drawing>
+      </w:r>
+    </w:p>
+    <w:p>
+      <w:pPr>
+        <w:spacing w:before="60" w:after="60" w:line="276" w:lineRule="auto"/>
+      </w:pPr>
+      <w:r>
+        <w:rPr>
+          <w:sz w:val="18"/>
+          <w:szCs w:val="18"/>
+        </w:rPr>
+        <w:t xml:space="preserve">B.2 — chatbotLogic.test.js: sessionId, detección de tags, limpieza de texto y validación de mensajes (PASS)</w:t>
+      </w:r>
+    </w:p>
+    <w:p>
+      <w:pPr>
+        <w:jc w:val="center"/>
+        <w:spacing w:before="120" w:after="120"/>
+      </w:pPr>
+      <w:r>
+        <w:drawing>
+          <wp:inline xmlns:wp="http://schemas.openxmlformats.org/drawingml/2006/wordprocessingDrawing">
+            <wp:extent cx="4067708" cy="5500000"/>
+            <wp:effectExtent l="0" t="0" r="0" b="0"/>
+            <wp:docPr id="103" name="Anexo103" descr="Evidencia"/>
+            <wp:cNvGraphicFramePr>
+              <a:graphicFrameLocks xmlns:a="http://schemas.openxmlformats.org/drawingml/2006/main" noChangeAspect="1"/>
+            </wp:cNvGraphicFramePr>
+            <a:graphic xmlns:a="http://schemas.openxmlformats.org/drawingml/2006/main">
+              <a:graphicData uri="http://schemas.openxmlformats.org/drawingml/2006/picture">
+                <pic:pic xmlns:pic="http://schemas.openxmlformats.org/drawingml/2006/picture">
+                  <pic:nvPicPr>
+                    <pic:cNvPr id="103" name="Anexo103"/>
+                    <pic:cNvPicPr/>
+                  </pic:nvPicPr>
+                  <pic:blipFill>
+                    <a:blip xmlns:r="http://schemas.openxmlformats.org/officeDocument/2006/relationships" r:embed="rId22"/>
+                    <a:stretch>
+                      <a:fillRect/>
+                    </a:stretch>
+                  </pic:blipFill>
+                  <pic:spPr>
+                    <a:xfrm>
+                      <a:off x="0" y="0"/>
+                      <a:ext cx="4067708" cy="5500000"/>
+                    </a:xfrm>
+                    <a:prstGeom prst="rect">
+                      <a:avLst/>
+                    </a:prstGeom>
+                    <a:ln>
+                      <a:noFill/>
+                    </a:ln>
+                  </pic:spPr>
+                </pic:pic>
+              </a:graphicData>
+            </a:graphic>
+          </wp:inline>
+        </w:drawing>
+      </w:r>
+    </w:p>
+    <w:p>
+      <w:pPr>
+        <w:spacing w:before="60" w:after="60" w:line="276" w:lineRule="auto"/>
+      </w:pPr>
+      <w:r>
+        <w:rPr>
+          <w:sz w:val="18"/>
+          <w:szCs w:val="18"/>
+        </w:rPr>
+        <w:t xml:space="preserve">B.3 — config.test.js: configuración del webhook, servidor de desarrollo y archivos HTML requeridos (PASS)</w:t>
+      </w:r>
+    </w:p>
+    <w:p>
+      <w:pPr>
+        <w:jc w:val="center"/>
+        <w:spacing w:before="120" w:after="120"/>
+      </w:pPr>
+      <w:r>
+        <w:drawing>
+          <wp:inline xmlns:wp="http://schemas.openxmlformats.org/drawingml/2006/wordprocessingDrawing">
+            <wp:extent cx="4680000" cy="3117005"/>
+            <wp:effectExtent l="0" t="0" r="0" b="0"/>
+            <wp:docPr id="104" name="Anexo104" descr="Evidencia"/>
+            <wp:cNvGraphicFramePr>
+              <a:graphicFrameLocks xmlns:a="http://schemas.openxmlformats.org/drawingml/2006/main" noChangeAspect="1"/>
+            </wp:cNvGraphicFramePr>
+            <a:graphic xmlns:a="http://schemas.openxmlformats.org/drawingml/2006/main">
+              <a:graphicData uri="http://schemas.openxmlformats.org/drawingml/2006/picture">
+                <pic:pic xmlns:pic="http://schemas.openxmlformats.org/drawingml/2006/picture">
+                  <pic:nvPicPr>
+                    <pic:cNvPr id="104" name="Anexo104"/>
+                    <pic:cNvPicPr/>
+                  </pic:nvPicPr>
+                  <pic:blipFill>
+                    <a:blip xmlns:r="http://schemas.openxmlformats.org/officeDocument/2006/relationships" r:embed="rId23"/>
+                    <a:stretch>
+                      <a:fillRect/>
+                    </a:stretch>
+                  </pic:blipFill>
+                  <pic:spPr>
+                    <a:xfrm>
+                      <a:off x="0" y="0"/>
+                      <a:ext cx="4680000" cy="3117005"/>
+                    </a:xfrm>
+                    <a:prstGeom prst="rect">
+                      <a:avLst/>
+                    </a:prstGeom>
+                    <a:ln>
+                      <a:noFill/>
+                    </a:ln>
+                  </pic:spPr>
+                </pic:pic>
+              </a:graphicData>
+            </a:graphic>
+          </wp:inline>
+        </w:drawing>
+      </w:r>
+    </w:p>
+    <w:p>
+      <w:r>
+        <w:br w:type="page"/>
+      </w:r>
+    </w:p>
+    <w:p>
+      <w:pPr>
+        <w:spacing w:before="180" w:after="60" w:line="276" w:lineRule="auto"/>
+      </w:pPr>
+      <w:r>
+        <w:rPr>
+          <w:b/>
+          <w:bCs/>
+          <w:color w:val="2E4057"/>
+          <w:sz w:val="22"/>
+          <w:szCs w:val="22"/>
+        </w:rPr>
+        <w:t>Anexo C — Pruebas Funcionales (chatFlow.test.js)</w:t>
+      </w:r>
+    </w:p>
+    <w:p>
+      <w:pPr>
+        <w:spacing w:before="60" w:after="60" w:line="276" w:lineRule="auto"/>
+      </w:pPr>
+      <w:r>
+        <w:rPr>
+          <w:sz w:val="18"/>
+          <w:szCs w:val="18"/>
+        </w:rPr>
+        <w:t xml:space="preserve">RF-01 al RF-07 aprobados · Tiempo: 81.572 s · Cubre saludo, catálogo, cálculo m², instalación, FAQ, COTIZAR y mensajes en distintos idiomas/estilos (PASS)</w:t>
+      </w:r>
+    </w:p>
+    <w:p>
+      <w:pPr>
+        <w:jc w:val="center"/>
+        <w:spacing w:before="120" w:after="120"/>
+      </w:pPr>
+      <w:r>
+        <w:drawing>
+          <wp:inline xmlns:wp="http://schemas.openxmlformats.org/drawingml/2006/wordprocessingDrawing">
+            <wp:extent cx="4680000" cy="2960670"/>
+            <wp:effectExtent l="0" t="0" r="0" b="0"/>
+            <wp:docPr id="105" name="Anexo105" descr="Evidencia"/>
+            <wp:cNvGraphicFramePr>
+              <a:graphicFrameLocks xmlns:a="http://schemas.openxmlformats.org/drawingml/2006/main" noChangeAspect="1"/>
+            </wp:cNvGraphicFramePr>
+            <a:graphic xmlns:a="http://schemas.openxmlformats.org/drawingml/2006/main">
+              <a:graphicData uri="http://schemas.openxmlformats.org/drawingml/2006/picture">
+                <pic:pic xmlns:pic="http://schemas.openxmlformats.org/drawingml/2006/picture">
+                  <pic:nvPicPr>
+                    <pic:cNvPr id="105" name="Anexo105"/>
+                    <pic:cNvPicPr/>
+                  </pic:nvPicPr>
+                  <pic:blipFill>
+                    <a:blip xmlns:r="http://schemas.openxmlformats.org/officeDocument/2006/relationships" r:embed="rId24"/>
+                    <a:stretch>
+                      <a:fillRect/>
+                    </a:stretch>
+                  </pic:blipFill>
+                  <pic:spPr>
+                    <a:xfrm>
+                      <a:off x="0" y="0"/>
+                      <a:ext cx="4680000" cy="2960670"/>
+                    </a:xfrm>
+                    <a:prstGeom prst="rect">
+                      <a:avLst/>
+                    </a:prstGeom>
+                    <a:ln>
+                      <a:noFill/>
+                    </a:ln>
+                  </pic:spPr>
+                </pic:pic>
+              </a:graphicData>
+            </a:graphic>
+          </wp:inline>
+        </w:drawing>
+      </w:r>
+    </w:p>
+    <w:p>
+      <w:pPr>
+        <w:spacing w:before="180" w:after="60" w:line="276" w:lineRule="auto"/>
+      </w:pPr>
+      <w:r>
+        <w:rPr>
+          <w:b/>
+          <w:bCs/>
+          <w:color w:val="2E4057"/>
+          <w:sz w:val="22"/>
+          <w:szCs w:val="22"/>
+        </w:rPr>
+        <w:t>Anexo D — Pruebas de Seguridad (security.test.js)</w:t>
+      </w:r>
+    </w:p>
+    <w:p>
+      <w:pPr>
+        <w:spacing w:before="60" w:after="60" w:line="276" w:lineRule="auto"/>
+      </w:pPr>
+      <w:r>
+        <w:rPr>
+          <w:sz w:val="18"/>
+          <w:szCs w:val="18"/>
+        </w:rPr>
+        <w:t xml:space="preserve">SEC-01 al SEC-06 aprobados · Tiempo: 56.418 s · Cubre XSS, SQL/NoSQL Injection, entradas extremas, CORS, rate limiting y validación de URLs de pago (PASS)</w:t>
+      </w:r>
+    </w:p>
+    <w:p>
+      <w:pPr>
+        <w:jc w:val="center"/>
+        <w:spacing w:before="120" w:after="120"/>
+      </w:pPr>
+      <w:r>
+        <w:drawing>
+          <wp:inline xmlns:wp="http://schemas.openxmlformats.org/drawingml/2006/wordprocessingDrawing">
+            <wp:extent cx="4680000" cy="3828517"/>
+            <wp:effectExtent l="0" t="0" r="0" b="0"/>
+            <wp:docPr id="106" name="Anexo106" descr="Evidencia"/>
+            <wp:cNvGraphicFramePr>
+              <a:graphicFrameLocks xmlns:a="http://schemas.openxmlformats.org/drawingml/2006/main" noChangeAspect="1"/>
+            </wp:cNvGraphicFramePr>
+            <a:graphic xmlns:a="http://schemas.openxmlformats.org/drawingml/2006/main">
+              <a:graphicData uri="http://schemas.openxmlformats.org/drawingml/2006/picture">
+                <pic:pic xmlns:pic="http://schemas.openxmlformats.org/drawingml/2006/picture">
+                  <pic:nvPicPr>
+                    <pic:cNvPr id="106" name="Anexo106"/>
+                    <pic:cNvPicPr/>
+                  </pic:nvPicPr>
+                  <pic:blipFill>
+                    <a:blip xmlns:r="http://schemas.openxmlformats.org/officeDocument/2006/relationships" r:embed="rId25"/>
+                    <a:stretch>
+                      <a:fillRect/>
+                    </a:stretch>
+                  </pic:blipFill>
+                  <pic:spPr>
+                    <a:xfrm>
+                      <a:off x="0" y="0"/>
+                      <a:ext cx="4680000" cy="3828517"/>
+                    </a:xfrm>
+                    <a:prstGeom prst="rect">
+                      <a:avLst/>
+                    </a:prstGeom>
+                    <a:ln>
+                      <a:noFill/>
+                    </a:ln>
+                  </pic:spPr>
+                </pic:pic>
+              </a:graphicData>
+            </a:graphic>
+          </wp:inline>
+        </w:drawing>
+      </w:r>
+    </w:p>
+    <w:p>
+      <w:r>
+        <w:br w:type="page"/>
+      </w:r>
+    </w:p>
+    <w:p>
+      <w:pPr>
+        <w:spacing w:before="180" w:after="60" w:line="276" w:lineRule="auto"/>
+      </w:pPr>
+      <w:r>
+        <w:rPr>
+          <w:b/>
+          <w:bCs/>
+          <w:color w:val="2E4057"/>
+          <w:sz w:val="22"/>
+          <w:szCs w:val="22"/>
+        </w:rPr>
+        <w:t>Anexo E — Pruebas de Integración</w:t>
+      </w:r>
+    </w:p>
+    <w:p>
+      <w:pPr>
+        <w:spacing w:before="60" w:after="60" w:line="276" w:lineRule="auto"/>
+      </w:pPr>
+      <w:r>
+        <w:rPr>
+          <w:sz w:val="18"/>
+          <w:szCs w:val="18"/>
+        </w:rPr>
+        <w:t xml:space="preserve">E.1 — webhook.test.js: conectividad n8n, formato JSON, campos requeridos, independencia de sesiones · Tiempo: 50.659 s (PASS)</w:t>
+      </w:r>
+    </w:p>
+    <w:p>
+      <w:pPr>
+        <w:jc w:val="center"/>
+        <w:spacing w:before="120" w:after="120"/>
+      </w:pPr>
+      <w:r>
+        <w:drawing>
+          <wp:inline xmlns:wp="http://schemas.openxmlformats.org/drawingml/2006/wordprocessingDrawing">
+            <wp:extent cx="4680000" cy="2418957"/>
+            <wp:effectExtent l="0" t="0" r="0" b="0"/>
+            <wp:docPr id="107" name="Anexo107" descr="Evidencia"/>
+            <wp:cNvGraphicFramePr>
+              <a:graphicFrameLocks xmlns:a="http://schemas.openxmlformats.org/drawingml/2006/main" noChangeAspect="1"/>
+            </wp:cNvGraphicFramePr>
+            <a:graphic xmlns:a="http://schemas.openxmlformats.org/drawingml/2006/main">
+              <a:graphicData uri="http://schemas.openxmlformats.org/drawingml/2006/picture">
+                <pic:pic xmlns:pic="http://schemas.openxmlformats.org/drawingml/2006/picture">
+                  <pic:nvPicPr>
+                    <pic:cNvPr id="107" name="Anexo107"/>
+                    <pic:cNvPicPr/>
+                  </pic:nvPicPr>
+                  <pic:blipFill>
+                    <a:blip xmlns:r="http://schemas.openxmlformats.org/officeDocument/2006/relationships" r:embed="rId26"/>
+                    <a:stretch>
+                      <a:fillRect/>
+                    </a:stretch>
+                  </pic:blipFill>
+                  <pic:spPr>
+                    <a:xfrm>
+                      <a:off x="0" y="0"/>
+                      <a:ext cx="4680000" cy="2418957"/>
+                    </a:xfrm>
+                    <a:prstGeom prst="rect">
+                      <a:avLst/>
+                    </a:prstGeom>
+                    <a:ln>
+                      <a:noFill/>
+                    </a:ln>
+                  </pic:spPr>
+                </pic:pic>
+              </a:graphicData>
+            </a:graphic>
+          </wp:inline>
+        </w:drawing>
+      </w:r>
+    </w:p>
+    <w:p>
+      <w:pPr>
+        <w:spacing w:before="60" w:after="60" w:line="276" w:lineRule="auto"/>
+      </w:pPr>
+      <w:r>
+        <w:rPr>
+          <w:sz w:val="18"/>
+          <w:szCs w:val="18"/>
+        </w:rPr>
+        <w:t xml:space="preserve">E.2 — frontend.test.js: servidor puerto 3000, archivos servidos, CORS y SPA fallback (PASS)</w:t>
+      </w:r>
+    </w:p>
+    <w:p>
+      <w:pPr>
+        <w:jc w:val="center"/>
+        <w:spacing w:before="120" w:after="120"/>
+      </w:pPr>
+      <w:r>
+        <w:drawing>
+          <wp:inline xmlns:wp="http://schemas.openxmlformats.org/drawingml/2006/wordprocessingDrawing">
+            <wp:extent cx="4680000" cy="2214362"/>
+            <wp:effectExtent l="0" t="0" r="0" b="0"/>
+            <wp:docPr id="108" name="Anexo108" descr="Evidencia"/>
+            <wp:cNvGraphicFramePr>
+              <a:graphicFrameLocks xmlns:a="http://schemas.openxmlformats.org/drawingml/2006/main" noChangeAspect="1"/>
+            </wp:cNvGraphicFramePr>
+            <a:graphic xmlns:a="http://schemas.openxmlformats.org/drawingml/2006/main">
+              <a:graphicData uri="http://schemas.openxmlformats.org/drawingml/2006/picture">
+                <pic:pic xmlns:pic="http://schemas.openxmlformats.org/drawingml/2006/picture">
+                  <pic:nvPicPr>
+                    <pic:cNvPr id="108" name="Anexo108"/>
+                    <pic:cNvPicPr/>
+                  </pic:nvPicPr>
+                  <pic:blipFill>
+                    <a:blip xmlns:r="http://schemas.openxmlformats.org/officeDocument/2006/relationships" r:embed="rId27"/>
+                    <a:stretch>
+                      <a:fillRect/>
+                    </a:stretch>
+                  </pic:blipFill>
+                  <pic:spPr>
+                    <a:xfrm>
+                      <a:off x="0" y="0"/>
+                      <a:ext cx="4680000" cy="2214362"/>
+                    </a:xfrm>
+                    <a:prstGeom prst="rect">
+                      <a:avLst/>
+                    </a:prstGeom>
+                    <a:ln>
+                      <a:noFill/>
+                    </a:ln>
+                  </pic:spPr>
+                </pic:pic>
+              </a:graphicData>
+            </a:graphic>
+          </wp:inline>
+        </w:drawing>
+      </w:r>
+    </w:p>
+    <w:p>
+      <w:r>
+        <w:br w:type="page"/>
+      </w:r>
+    </w:p>
+    <w:p>
+      <w:pPr>
+        <w:spacing w:before="180" w:after="60" w:line="276" w:lineRule="auto"/>
+      </w:pPr>
+      <w:r>
+        <w:rPr>
+          <w:b/>
+          <w:bCs/>
+          <w:color w:val="2E4057"/>
+          <w:sz w:val="22"/>
+          <w:szCs w:val="22"/>
+        </w:rPr>
+        <w:t>Anexo F — Pruebas de Rendimiento (carga concurrente)</w:t>
+      </w:r>
+    </w:p>
+    <w:p>
+      <w:pPr>
+        <w:spacing w:before="60" w:after="60" w:line="276" w:lineRule="auto"/>
+      </w:pPr>
+      <w:r>
+        <w:rPr>
+          <w:sz w:val="18"/>
+          <w:szCs w:val="18"/>
+        </w:rPr>
+        <w:t xml:space="preserve">F.1 — Escenarios Calentamiento, Carga baja y Carga media: error rate 0.0% en todos los escenarios, todos los umbrales P50/P90/P99 cumplidos</w:t>
+      </w:r>
+    </w:p>
+    <w:p>
+      <w:pPr>
+        <w:jc w:val="center"/>
+        <w:spacing w:before="120" w:after="120"/>
+      </w:pPr>
+      <w:r>
+        <w:drawing>
+          <wp:inline xmlns:wp="http://schemas.openxmlformats.org/drawingml/2006/wordprocessingDrawing">
+            <wp:extent cx="2728000" cy="5500000"/>
+            <wp:effectExtent l="0" t="0" r="0" b="0"/>
+            <wp:docPr id="109" name="Anexo109" descr="Evidencia"/>
+            <wp:cNvGraphicFramePr>
+              <a:graphicFrameLocks xmlns:a="http://schemas.openxmlformats.org/drawingml/2006/main" noChangeAspect="1"/>
+            </wp:cNvGraphicFramePr>
+            <a:graphic xmlns:a="http://schemas.openxmlformats.org/drawingml/2006/main">
+              <a:graphicData uri="http://schemas.openxmlformats.org/drawingml/2006/picture">
+                <pic:pic xmlns:pic="http://schemas.openxmlformats.org/drawingml/2006/picture">
+                  <pic:nvPicPr>
+                    <pic:cNvPr id="109" name="Anexo109"/>
+                    <pic:cNvPicPr/>
+                  </pic:nvPicPr>
+                  <pic:blipFill>
+                    <a:blip xmlns:r="http://schemas.openxmlformats.org/officeDocument/2006/relationships" r:embed="rId28"/>
+                    <a:stretch>
+                      <a:fillRect/>
+                    </a:stretch>
+                  </pic:blipFill>
+                  <pic:spPr>
+                    <a:xfrm>
+                      <a:off x="0" y="0"/>
+                      <a:ext cx="2728000" cy="5500000"/>
+                    </a:xfrm>
+                    <a:prstGeom prst="rect">
+                      <a:avLst/>
+                    </a:prstGeom>
+                    <a:ln>
+                      <a:noFill/>
+                    </a:ln>
+                  </pic:spPr>
+                </pic:pic>
+              </a:graphicData>
+            </a:graphic>
+          </wp:inline>
+        </w:drawing>
+      </w:r>
+    </w:p>
+    <w:p>
+      <w:pPr>
+        <w:spacing w:before="60" w:after="60" w:line="276" w:lineRule="auto"/>
+      </w:pPr>
+      <w:r>
+        <w:rPr>
+          <w:sz w:val="18"/>
+          <w:szCs w:val="18"/>
+        </w:rPr>
+        <w:t xml:space="preserve">F.2 — Escenario Carga alta (20 req / 10 concurrentes): P90=5938 ms · Error rate 0.0% · Resultado global: TODOS LOS UMBRALES CUMPLIDOS</w:t>
+      </w:r>
+    </w:p>
+    <w:p>
+      <w:pPr>
+        <w:jc w:val="center"/>
+        <w:spacing w:before="120" w:after="120"/>
+      </w:pPr>
+      <w:r>
+        <w:drawing>
+          <wp:inline xmlns:wp="http://schemas.openxmlformats.org/drawingml/2006/wordprocessingDrawing">
+            <wp:extent cx="4680000" cy="4561926"/>
+            <wp:effectExtent l="0" t="0" r="0" b="0"/>
+            <wp:docPr id="110" name="Anexo110" descr="Evidencia"/>
+            <wp:cNvGraphicFramePr>
+              <a:graphicFrameLocks xmlns:a="http://schemas.openxmlformats.org/drawingml/2006/main" noChangeAspect="1"/>
+            </wp:cNvGraphicFramePr>
+            <a:graphic xmlns:a="http://schemas.openxmlformats.org/drawingml/2006/main">
+              <a:graphicData uri="http://schemas.openxmlformats.org/drawingml/2006/picture">
+                <pic:pic xmlns:pic="http://schemas.openxmlformats.org/drawingml/2006/picture">
+                  <pic:nvPicPr>
+                    <pic:cNvPr id="110" name="Anexo110"/>
+                    <pic:cNvPicPr/>
+                  </pic:nvPicPr>
+                  <pic:blipFill>
+                    <a:blip xmlns:r="http://schemas.openxmlformats.org/officeDocument/2006/relationships" r:embed="rId29"/>
+                    <a:stretch>
+                      <a:fillRect/>
+                    </a:stretch>
+                  </pic:blipFill>
+                  <pic:spPr>
+                    <a:xfrm>
+                      <a:off x="0" y="0"/>
+                      <a:ext cx="4680000" cy="4561926"/>
+                    </a:xfrm>
+                    <a:prstGeom prst="rect">
+                      <a:avLst/>
+                    </a:prstGeom>
+                    <a:ln>
+                      <a:noFill/>
+                    </a:ln>
+                  </pic:spPr>
+                </pic:pic>
+              </a:graphicData>
+            </a:graphic>
+          </wp:inline>
+        </w:drawing>
+      </w:r>
+    </w:p>
+    <w:p>
+      <w:r>
+        <w:br w:type="page"/>
+      </w:r>
+    </w:p>
+    <w:p>
+      <w:pPr>
+        <w:spacing w:before="180" w:after="60" w:line="276" w:lineRule="auto"/>
+      </w:pPr>
+      <w:r>
+        <w:rPr>
+          <w:b/>
+          <w:bCs/>
+          <w:color w:val="2E4057"/>
+          <w:sz w:val="22"/>
+          <w:szCs w:val="22"/>
+        </w:rPr>
+        <w:t>Anexo G — Métricas del Agente IA (interacción real)</w:t>
+      </w:r>
+    </w:p>
+    <w:p>
+      <w:pPr>
+        <w:spacing w:before="60" w:after="60" w:line="276" w:lineRule="auto"/>
+      </w:pPr>
+      <w:r>
+        <w:rPr>
+          <w:sz w:val="18"/>
+          <w:szCs w:val="18"/>
+        </w:rPr>
+        <w:t xml:space="preserve">Latencia total: 1.2 s · TTFT (Time to First Token): 250 ms · Velocidad de salida: 45 tokens/s</w:t>
+      </w:r>
+    </w:p>
+    <w:p>
+      <w:pPr>
+        <w:jc w:val="center"/>
+        <w:spacing w:before="120" w:after="120"/>
+      </w:pPr>
+      <w:r>
+        <w:drawing>
+          <wp:inline xmlns:wp="http://schemas.openxmlformats.org/drawingml/2006/wordprocessingDrawing">
+            <wp:extent cx="4680000" cy="1505304"/>
+            <wp:effectExtent l="0" t="0" r="0" b="0"/>
+            <wp:docPr id="111" name="Anexo111" descr="Evidencia"/>
+            <wp:cNvGraphicFramePr>
+              <a:graphicFrameLocks xmlns:a="http://schemas.openxmlformats.org/drawingml/2006/main" noChangeAspect="1"/>
+            </wp:cNvGraphicFramePr>
+            <a:graphic xmlns:a="http://schemas.openxmlformats.org/drawingml/2006/main">
+              <a:graphicData uri="http://schemas.openxmlformats.org/drawingml/2006/picture">
+                <pic:pic xmlns:pic="http://schemas.openxmlformats.org/drawingml/2006/picture">
+                  <pic:nvPicPr>
+                    <pic:cNvPr id="111" name="Anexo111"/>
+                    <pic:cNvPicPr/>
+                  </pic:nvPicPr>
+                  <pic:blipFill>
+                    <a:blip xmlns:r="http://schemas.openxmlformats.org/officeDocument/2006/relationships" r:embed="rId30"/>
+                    <a:stretch>
+                      <a:fillRect/>
+                    </a:stretch>
+                  </pic:blipFill>
+                  <pic:spPr>
+                    <a:xfrm>
+                      <a:off x="0" y="0"/>
+                      <a:ext cx="4680000" cy="1505304"/>
+                    </a:xfrm>
+                    <a:prstGeom prst="rect">
+                      <a:avLst/>
+                    </a:prstGeom>
+                    <a:ln>
+                      <a:noFill/>
+                    </a:ln>
+                  </pic:spPr>
+                </pic:pic>
+              </a:graphicData>
+            </a:graphic>
+          </wp:inline>
+        </w:drawing>
+      </w:r>
+    </w:p>
+    <w:p>
+      <w:pPr>
+        <w:spacing w:before="180" w:after="60" w:line="276" w:lineRule="auto"/>
+      </w:pPr>
+      <w:r>
+        <w:rPr>
+          <w:b/>
+          <w:bCs/>
+          <w:color w:val="2E4057"/>
+          <w:sz w:val="22"/>
+          <w:szCs w:val="22"/>
+        </w:rPr>
+        <w:t>Anexo H — Lighthouse (escritorio)</w:t>
+      </w:r>
+    </w:p>
+    <w:p>
+      <w:pPr>
+        <w:spacing w:before="60" w:after="60" w:line="276" w:lineRule="auto"/>
+      </w:pPr>
+      <w:r>
+        <w:rPr>
+          <w:sz w:val="18"/>
+          <w:szCs w:val="18"/>
+        </w:rPr>
+        <w:t xml:space="preserve">Rendimiento: 63 · Accesibilidad: 84 · SEO: 92 · Recomendaciones: 78 · Navegación con agentes: 1/2</w:t>
+      </w:r>
+    </w:p>
+    <w:p>
+      <w:pPr>
+        <w:jc w:val="center"/>
+        <w:spacing w:before="120" w:after="120"/>
+      </w:pPr>
+      <w:r>
+        <w:drawing>
+          <wp:inline xmlns:wp="http://schemas.openxmlformats.org/drawingml/2006/wordprocessingDrawing">
+            <wp:extent cx="4680000" cy="2442932"/>
+            <wp:effectExtent l="0" t="0" r="0" b="0"/>
+            <wp:docPr id="112" name="Anexo112" descr="Evidencia"/>
+            <wp:cNvGraphicFramePr>
+              <a:graphicFrameLocks xmlns:a="http://schemas.openxmlformats.org/drawingml/2006/main" noChangeAspect="1"/>
+            </wp:cNvGraphicFramePr>
+            <a:graphic xmlns:a="http://schemas.openxmlformats.org/drawingml/2006/main">
+              <a:graphicData uri="http://schemas.openxmlformats.org/drawingml/2006/picture">
+                <pic:pic xmlns:pic="http://schemas.openxmlformats.org/drawingml/2006/picture">
+                  <pic:nvPicPr>
+                    <pic:cNvPr id="112" name="Anexo112"/>
+                    <pic:cNvPicPr/>
+                  </pic:nvPicPr>
+                  <pic:blipFill>
+                    <a:blip xmlns:r="http://schemas.openxmlformats.org/officeDocument/2006/relationships" r:embed="rId31"/>
+                    <a:stretch>
+                      <a:fillRect/>
+                    </a:stretch>
+                  </pic:blipFill>
+                  <pic:spPr>
+                    <a:xfrm>
+                      <a:off x="0" y="0"/>
+                      <a:ext cx="4680000" cy="2442932"/>
+                    </a:xfrm>
+                    <a:prstGeom prst="rect">
+                      <a:avLst/>
+                    </a:prstGeom>
+                    <a:ln>
+                      <a:noFill/>
+                    </a:ln>
+                  </pic:spPr>
+                </pic:pic>
+              </a:graphicData>
+            </a:graphic>
+          </wp:inline>
+        </w:drawing>
+      </w:r>
+    </w:p>
+    <w:p>
+      <w:pPr>
+        <w:spacing w:before="180" w:after="60" w:line="276" w:lineRule="auto"/>
+      </w:pPr>
+      <w:r>
+        <w:rPr>
+          <w:b/>
+          <w:bCs/>
+          <w:color w:val="2E4057"/>
+          <w:sz w:val="22"/>
+          <w:szCs w:val="22"/>
+        </w:rPr>
+        <w:t>Anexo I — Monitoreo UptimeRobot (cespedsintético.cl)</w:t>
+      </w:r>
+    </w:p>
+    <w:p>
+      <w:pPr>
+        <w:spacing w:before="60" w:after="60" w:line="276" w:lineRule="auto"/>
+      </w:pPr>
+      <w:r>
+        <w:rPr>
+          <w:sz w:val="18"/>
+          <w:szCs w:val="18"/>
+        </w:rPr>
+        <w:t xml:space="preserve">Monitor HTTP/S activo · Se revisa cada 5 minutos · Captura tomada durante período de pruebas</w:t>
+      </w:r>
+    </w:p>
+    <w:p>
+      <w:pPr>
+        <w:jc w:val="center"/>
+        <w:spacing w:before="120" w:after="120"/>
+      </w:pPr>
+      <w:r>
+        <w:drawing>
+          <wp:inline xmlns:wp="http://schemas.openxmlformats.org/drawingml/2006/wordprocessingDrawing">
+            <wp:extent cx="4680000" cy="2135533"/>
+            <wp:effectExtent l="0" t="0" r="0" b="0"/>
+            <wp:docPr id="113" name="Anexo113" descr="Evidencia"/>
+            <wp:cNvGraphicFramePr>
+              <a:graphicFrameLocks xmlns:a="http://schemas.openxmlformats.org/drawingml/2006/main" noChangeAspect="1"/>
+            </wp:cNvGraphicFramePr>
+            <a:graphic xmlns:a="http://schemas.openxmlformats.org/drawingml/2006/main">
+              <a:graphicData uri="http://schemas.openxmlformats.org/drawingml/2006/picture">
+                <pic:pic xmlns:pic="http://schemas.openxmlformats.org/drawingml/2006/picture">
+                  <pic:nvPicPr>
+                    <pic:cNvPr id="113" name="Anexo113"/>
+                    <pic:cNvPicPr/>
+                  </pic:nvPicPr>
+                  <pic:blipFill>
+                    <a:blip xmlns:r="http://schemas.openxmlformats.org/officeDocument/2006/relationships" r:embed="rId32"/>
+                    <a:stretch>
+                      <a:fillRect/>
+                    </a:stretch>
+                  </pic:blipFill>
+                  <pic:spPr>
+                    <a:xfrm>
+                      <a:off x="0" y="0"/>
+                      <a:ext cx="4680000" cy="2135533"/>
+                    </a:xfrm>
+                    <a:prstGeom prst="rect">
+                      <a:avLst/>
+                    </a:prstGeom>
                     <a:ln>
                       <a:noFill/>
                     </a:ln>

</xml_diff>